<commit_message>
chore: Finalisasi Dokumen Tesis (Presentasi, Poster, Lembar Bimbingan, Roadmap)
</commit_message>
<xml_diff>
--- a/PENGERJAAN TESIS BAB I - BAB V/front_matter/FRONT_MATTER_DRAFT.docx
+++ b/PENGERJAAN TESIS BAB I - BAB V/front_matter/FRONT_MATTER_DRAFT.docx
@@ -1048,6 +1048,13 @@
         <w:jc w:val="center"/>
       </w:pPr>
       <w:r/>
+      <w:r>
+        <w:fldChar w:fldCharType="begin"/>
+        <w:instrText xml:space="preserve">TOC \o "1-3" \h \z \u</w:instrText>
+        <w:fldChar w:fldCharType="separate"/>
+        <w:t>Klik kanan di sini dan pilih 'Update Field' untuk menampilkan Daftar Isi otomatis</w:t>
+        <w:fldChar w:fldCharType="end"/>
+      </w:r>
     </w:p>
     <w:p>
       <w:pPr>
@@ -1113,7 +1120,7 @@
     </w:p>
     <w:p>
       <w:r>
-        <w:t>Lampiran 1 – Kumpulan Kode Pemrograman Python</w:t>
+        <w:t>Lampiran 1 – Kode Python untuk olahdata</w:t>
       </w:r>
     </w:p>
     <w:p>
@@ -1252,12 +1259,7 @@
         <w:jc w:val="both"/>
       </w:pPr>
       <w:r>
-        <w:rPr>
-          <w:rFonts w:ascii="Times New Roman" w:hAnsi="Times New Roman"/>
-          <w:b w:val="0"/>
-          <w:sz w:val="22"/>
-        </w:rPr>
-        <w:t>[Isi Abstrak Bahasa Indonesia - maksimal 250 kata, font 11pt sesuai Pedoman 4.1.2c]</w:t>
+        <w:t>Penelitian ini mengembangkan strategi segmentasi probabilistik untuk mengoptimalkan rekrutmen calon mahasiswa baru di ITSNU Pekalongan. Kompleksitas data pendaftaran dengan dimensi tinggi, seperti variasi teks dari kolom nama, asal sekolah, dan alamat, menjadi tantangan dalam pengelompokan menggunakan metode konvensional. Pendekatan hybrid diusulkan dengan mengintegrasikan model bahasa IndoBERT untuk ekstraksi fitur semantik berdimensi 768, Gaussian Mixture Model (GMM) untuk clustering probabilistik, dan Large Language Model (LLM) untuk generasi persona secara otomatis. Metodologi CRISP-DM diterapkan pada data pendaftaran periode 2019-2024. Evaluasi optimalisasi jumlah cluster (k) menggunakan skor Bayesian Information Criterion (BIC), Silhouette Coefficient, dan Adjusted Rand Index (ARI) menunjukkan bahwa model stabil pada k=5. Hasil segmentasi mengidentifikasi lima persona utama: Kelompok Dominan Regional, Kelompok Potensial Akademik, Kelompok Spesifik Geografis, Kelompok Diversifikasi Jalur, dan Kelompok Anomali Jarak. Analisis pergerakan cluster antar tahun yang dihasilkan oleh LLM mengkonfirmasi dinamika pergeseran minat yang stabil namun memiliki tren adaptif. Integrasi IndoBERT, GMM, dan LLM terbukti mampu mengatasi permasalahan high-dimensionality serta memberikan deskripsi klaster yang lebih kaya dan relevan secara bisnis, mendukung pengambilan keputusan rekrutmen yang lebih terarah dan efisien.</w:t>
       </w:r>
     </w:p>
     <w:p>
@@ -1415,12 +1417,7 @@
         <w:jc w:val="both"/>
       </w:pPr>
       <w:r>
-        <w:rPr>
-          <w:rFonts w:ascii="Times New Roman" w:hAnsi="Times New Roman"/>
-          <w:b w:val="0"/>
-          <w:sz w:val="22"/>
-        </w:rPr>
-        <w:t>[Isi Abstract Bahasa Inggris - maksimal 250 kata, font 11pt sesuai Pedoman 4.1.2c]</w:t>
+        <w:t>This research develops a probabilistic segmentation strategy to optimize the recruitment of prospective new students at ITSNU Pekalongan. The complexity of high-dimensional enrollment data, such as text variations in name, school origin, and address columns, poses challenges for clustering using conventional methods. A hybrid approach is proposed by integrating the IndoBERT language model for 768-dimensional semantic feature extraction, Gaussian Mixture Model (GMM) for probabilistic clustering, and Large Language Model (LLM) for automated persona generation. The CRISP-DM methodology is applied to registration data from 2019-2024. Evaluation of cluster quantity optimization (k) using Bayesian Information Criterion (BIC), Silhouette Coefficient, and Adjusted Rand Index (ARI) scores indicates model stability at k=5. The segmentation results identify five main personas: Regional Dominant Group, Academic Potential Group, Geographic Specific Group, Pathway Diversification Group, and Distance Anomaly Group. Causal analysis of cluster movements across years generated by the LLM confirms the dynamics of interest shifts that are stable yet adaptive in trend. The integration of IndoBERT, GMM, and LLM is proven capable of overcoming high-dimensionality issues while providing richer, business-relevant cluster descriptions, thereby supporting more targeted and efficient recruitment decision-making.</w:t>
       </w:r>
     </w:p>
     <w:p>

</xml_diff>